<commit_message>
Updated article without citation completion.
</commit_message>
<xml_diff>
--- a/docs/paper/supplement_document.docx
+++ b/docs/paper/supplement_document.docx
@@ -34,7 +34,7 @@
         <w:rPr>
           <w:b/>
         </w:rPr>
-        <w:t>Purpose. This working supplement consolidates technical reproducibility material for the historical reporting experiment, reference-standard development and final-codebook compliance audit, post-compliance-audit main-batch rescoring, MARS evaluation, planned final end-to-end governance verification, and deterministic sampling/post-stratification analyses. Historical reporter prompt/schema text is preserved exactly as executed; the supplement documents, rather than silently corrects, the tested inconsistencies.</w:t>
+        <w:t>Purpose. This working supplement consolidates technical reproducibility material for the historical reporting experiment, reference-standard development and final-codebook compliance audit, post-compliance-audit main-batch rescoring, MARS evaluation, completed controlled-environment end-to-end governance verification, and deterministic sampling/post-stratification analyses. Historical reporter prompt/schema text is preserved exactly as executed; the supplement documents, rather than silently corrects, the tested inconsistencies.</w:t>
       </w:r>
     </w:p>
     <w:p>
@@ -7442,7 +7442,7 @@
         <w:pStyle w:val="Heading1"/>
       </w:pPr>
       <w:r>
-        <w:t>Supplementary Material 7 — Planned final frozen-build governance verification</w:t>
+        <w:t>Supplementary Material 7 — Completed controlled-environment governance verification</w:t>
       </w:r>
     </w:p>
     <w:p>
@@ -7450,49 +7450,49 @@
         <w:pStyle w:val="Heading2"/>
       </w:pPr>
       <w:r>
-        <w:t>S7.1 Governance-critical end-to-end invariants (pending pre-submission execution)</w:t>
+        <w:t>S7.1 Frozen build, test inputs, and execution scope</w:t>
       </w:r>
     </w:p>
     <w:p>
       <w:pPr/>
       <w:r>
-        <w:t>• Freeze and record the application commit/release, controlled test-data type, Qwen 2.5 7B model name and digest/version, extraction prompt version 1.0.0/hash, and tool/output schema version/hash.</w:t>
+        <w:t>The predefined governance-critical tests were executed through the backend API and again through the UI on 1 October 2026 (runs logged at 01:58-02:01 UTC on 2 October). API: clean commit be8acaf; UI: clean commit d7446d6, differing only by the committed API test-run record. Both were on branch model-finetuning without uncommitted changes; the UI execution was video-recorded. Each run created a fresh synthetic child and used short observations written specifically for the test suite, with no corpus-derived or participant text. The extractor was the live (not mocked) Qwen 2.5 7B endpoint qwen2.5:7b under Ollama 0.33.3; recorded digest 845dbda0ea48, 7.6B parameters, Q4_K_M quantization. The active report mode was deterministic. The historically evaluated prompt condition in the manuscript is v1.0.0; the supplied test record does not include independent extraction-prompt or tool/output-schema hashes, which should be identified in the final reproducibility release manifest.</w:t>
       </w:r>
     </w:p>
     <w:p>
       <w:pPr/>
       <w:r>
-        <w:t>• Confirm that an unverified AI-derived record cannot enter longitudinal analytics.</w:t>
+        <w:t>S7.2 Analytics gate: PASS (UI 4 unreviewed schema-valid records → 0 analytics-eligible; API 6 unreviewed schema-valid records → 0 eligible). No unreviewed AI-derived record entered longitudinal analytics, and the analytics were withheld.</w:t>
       </w:r>
     </w:p>
     <w:p>
       <w:pPr/>
       <w:r>
-        <w:t>• Confirm that an intervention specialist can verify or correct the record before it becomes analytics-eligible.</w:t>
+        <w:t>S7.3 Professional review and correction: PASS. In the UI run, one record was VERIFIED and another CORRECTED, making exactly two eligible, while the other unreviewed records remained excluded. In the API run, two were VERIFIED and two CORRECTED, making exactly four eligible. Changing prompt_level from independent to full_physical produced v2; original AI-extracted v1 and original contributor text remained unchanged. The deterministic report evidence referenced corrected v2 and not superseded v1.</w:t>
       </w:r>
     </w:p>
     <w:p>
       <w:pPr/>
       <w:r>
-        <w:t>• Confirm that corrected evidence propagates to deterministic downstream calculations while the immutable original source and prior structured version remain preserved.</w:t>
+        <w:t>S7.4 Adequacy and withholding: PASS. With too few professionally reviewed records from one contributor represented in two settings, the deterministic router rated the evidence INSUFFICIENT; no longitudinal metrics were produced. The operational report explicitly displayed “All longitudinal analytics were withheld: Evidence level: insufficient.” and enumerated the failed adequacy checks. Record eligibility after professional review was therefore distinct from the sufficiency of the cumulative evidence to support analytics.</w:t>
       </w:r>
     </w:p>
     <w:p>
       <w:pPr/>
       <w:r>
-        <w:t>• Confirm that an analysis withheld by the adequacy router remains explicitly withheld in the deterministic operational report.</w:t>
+        <w:t>S7.5 Negative authorization: PASS. A signed-in parent was redirected away from professional analytics and review pages; direct API attempts to read the record, verify, correct, compute analytics, or generate a report returned HTTP 403, leaving the record unreviewed. The API run separately confirmed these denials for parent and teacher contributor roles.</w:t>
       </w:r>
     </w:p>
     <w:p>
       <w:pPr/>
       <w:r>
-        <w:t>• Trace at least one displayed KPI/report item through its structured-evidence identifier/version to the immutable source observation; repeat the drill-down after a correction/version change and verify that the displayed result follows the corrected version while provenance to the original source and prior version remains intact.</w:t>
+        <w:t>S7.6 Overall result: all predefined governance-critical conditions passed (API 77/77 tests; UI 9/9 scenarios). These runs directly verify the corrected record reference in the deterministic report and preservation of immutable source/earlier versions. The supplied test account does not separately document interactive drill-down for every dashboard KPI through evidence ID/version to original source; no claim of exhaustive UI drill-down verification is made.</w:t>
       </w:r>
     </w:p>
     <w:p>
       <w:pPr/>
       <w:r>
-        <w:t>Status: pending. These are planned pre-submission verification invariants, not completed study results. The final manuscript will report the frozen run outcome and any defect corrected before the run.</w:t>
+        <w:t>S7.7 Four issues resolved before the accepted frozen executions. (1) Uncommitted frontend files had prevented the UI build; they were reconstructed and checked against existing frontend tests. (2) UI/backend adequacy-status capitalization mismatch concealed the withheld-analytics notice; the UI handling was corrected. (3) The deterministic report originally omitted an explicit “analytics withheld” sentence despite indicating insufficient evidence; report text and the assertion were tightened. (4) The first frozen API attempt failed 5/77 checks because test-side local-date logic disagreed with UTC review-period dates; the date handling in tests only was repaired, with no application-code change. The final API and UI executions passed after these fixes. Unassessed scope: review periods have no site time zone, and an attempt to verify a superseded original record after correction was not tested. These are synthetic controlled functional tests, not clinical-effectiveness, independent usability, penetration-security, or production-reliability assessments.</w:t>
       </w:r>
     </w:p>
     <w:p>

</xml_diff>